<commit_message>
docs: update README, SRS, PPT, Research Paper, and deliverables to reflect Hybrid Graph RAG and Remedial Mastery Mode
</commit_message>
<xml_diff>
--- a/SmartInterview_SRS_Final.docx
+++ b/SmartInterview_SRS_Final.docx
@@ -295,7 +295,15 @@
         <w:pStyle w:val="ListBullet"/>
       </w:pPr>
       <w:r>
-        <w:t>Domain-filtered semantic retrieval from 402 curated computer science chunks in ChromaDB (Top-3 chunks; Hit@1: 96.97%, Hit@3: 100%, MRR: 0.9798).</w:t>
+        <w:t>Hybrid Graph RAG Tri-Retrieval: Synchronized dense vector search (ChromaDB), lexical keyword search (BM25Okapi), and directed knowledge graph traversal (NetworkX/Neo4j) across 50 concepts in 8 domains.</w:t>
+      </w:r>
+    </w:p>
+    <w:p>
+      <w:pPr>
+        <w:pStyle w:val="ListBullet"/>
+      </w:pPr>
+      <w:r>
+        <w:t>Reciprocal Rank Fusion (RRF) and Cross-Encoder Reranking providing authoritative context grounding (Hit@1: 96.97%, Hit@3: 100%, MRR: 0.9798).</w:t>
       </w:r>
     </w:p>
     <w:p>
@@ -312,6 +320,14 @@
       </w:pPr>
       <w:r>
         <w:t>Deterministic adaptive progression adjusting difficulty and cognitive depth after each response (Python state engine).</w:t>
+      </w:r>
+    </w:p>
+    <w:p>
+      <w:pPr>
+        <w:pStyle w:val="ListBullet"/>
+      </w:pPr>
+      <w:r>
+        <w:t>Remedial Mastery Mode: Post-interview root-cause prerequisite diagnosis, interactive flashcards, dynamic AI study notes, and targeted retry practice sessions.</w:t>
       </w:r>
     </w:p>
     <w:p>
@@ -343,7 +359,7 @@
         <w:pStyle w:val="ListBullet"/>
       </w:pPr>
       <w:r>
-        <w:t>Comprehensive performance dashboard and downloadable PDF report.</w:t>
+        <w:t>Comprehensive performance dashboard, remediation roadmaps, and downloadable PDF reports.</w:t>
       </w:r>
     </w:p>
     <w:p>
@@ -493,6 +509,46 @@
       </w:pPr>
       <w:r>
         <w:t>RI.01.11 Downloadable PDF Interview Report: Generate a comprehensive post-interview report detailing performance and progression.</w:t>
+      </w:r>
+    </w:p>
+    <w:p>
+      <w:pPr>
+        <w:pStyle w:val="ListBullet"/>
+      </w:pPr>
+      <w:r>
+        <w:t>RI.01.12 Hybrid Graph RAG Retrieval: Simultaneously execute dense vector search, BM25Okapi lexical matching, and directed knowledge graph prerequisite traversal, fusing results via Reciprocal Rank Fusion (RRF).</w:t>
+      </w:r>
+    </w:p>
+    <w:p>
+      <w:pPr>
+        <w:pStyle w:val="ListBullet"/>
+      </w:pPr>
+      <w:r>
+        <w:t>RI.01.13 Remedial Mastery Weakness Diagnosis: Automatically trace failed questions back through the knowledge graph to detect missing prerequisite concepts.</w:t>
+      </w:r>
+    </w:p>
+    <w:p>
+      <w:pPr>
+        <w:pStyle w:val="ListBullet"/>
+      </w:pPr>
+      <w:r>
+        <w:t>RI.01.14 Dynamic Study Notes &amp; Flashcards: Generate targeted revision summaries, micro-lessons, and interactive flashcards for diagnosed weaknesses.</w:t>
+      </w:r>
+    </w:p>
+    <w:p>
+      <w:pPr>
+        <w:pStyle w:val="ListBullet"/>
+      </w:pPr>
+      <w:r>
+        <w:t>RI.01.15 Targeted Retry Drills: Launch focused practice mini-sessions allowing candidates to re-attempt failed concepts until mastery is confirmed.</w:t>
+      </w:r>
+    </w:p>
+    <w:p>
+      <w:pPr>
+        <w:pStyle w:val="ListBullet"/>
+      </w:pPr>
+      <w:r>
+        <w:t>RI.01.16 Remediation PDF Report: Produce downloadable diagnostic remediation roadmaps with visual radar analytics.</w:t>
       </w:r>
     </w:p>
     <w:p>
@@ -987,7 +1043,7 @@
         <w:pStyle w:val="ListBullet"/>
       </w:pPr>
       <w:r>
-        <w:t>Frontend Architecture: React 18/19, Vite, Tailwind CSS v4, Context API for state management.</w:t>
+        <w:t>Frontend Architecture: React 18/19, Vite, Tailwind CSS v4, Context API for state management, interactive remediation study dashboard (`Remediation.jsx`, `RemediationModal.jsx`).</w:t>
       </w:r>
     </w:p>
     <w:p>
@@ -995,7 +1051,7 @@
         <w:pStyle w:val="ListBullet"/>
       </w:pPr>
       <w:r>
-        <w:t>Backend Services: FastAPI 0.115, Python 3.10+, Uvicorn ASGI, modular routing (auth, resumes, evaluation).</w:t>
+        <w:t>Backend Services: FastAPI 0.115, Python 3.10+, Uvicorn ASGI, modular routing (`auth`, `resumes`, `interviews`, `remediation_service`, `report_service`).</w:t>
       </w:r>
     </w:p>
     <w:p>
@@ -1003,7 +1059,15 @@
         <w:pStyle w:val="ListBullet"/>
       </w:pPr>
       <w:r>
-        <w:t>Vector Grounding (RAG): ChromaDB 0.6.3 storing pre-indexed computer science chunks. Embeddings generated via SentenceTransformers `all-MiniLM-L6-v2`.</w:t>
+        <w:t>Hybrid Graph RAG Engine: Tri-retrieval pipeline featuring ChromaDB (dense semantic vectors), rank-bm25 (BM25Okapi lexical matching), and NetworkX/Neo4j (directed knowledge graph store). Results merged via Reciprocal Rank Fusion (RRF) and scored via cross-encoder reranking.</w:t>
+      </w:r>
+    </w:p>
+    <w:p>
+      <w:pPr>
+        <w:pStyle w:val="ListBullet"/>
+      </w:pPr>
+      <w:r>
+        <w:t>Remedial Mastery Engine: Knowledge Graph root-cause tracing, automated micro-lesson generation, interactive flashcard synthesis, and targeted retry practice drill generation.</w:t>
       </w:r>
     </w:p>
     <w:p>
@@ -1037,12 +1101,12 @@
     </w:p>
     <w:p>
       <w:r>
-        <w:t>Software Validation: Ensures the platform satisfies user needs. Tests confirmed that candidates can seamlessly upload a resume and JD, triggering an interview accurately mapped to their role overlapping and gap areas.</w:t>
+        <w:t>Software Validation: Ensures the platform satisfies user needs. Tests confirmed that candidates can seamlessly upload a resume and JD, triggering an interview accurately mapped to their role overlapping and gap areas, and proceed to remedial practice upon session completion.</w:t>
       </w:r>
     </w:p>
     <w:p>
       <w:r>
-        <w:t>Software Verification: Confirms adherence to design. Evaluated API schemas, foreign key constraints in MySQL, and mathematical verification of the 5-factor weighting formula.</w:t>
+        <w:t>Software Verification: Confirms adherence to design. Evaluated API schemas, foreign key constraints in MySQL, mathematical verification of the 5-factor weighting formula, and 274 unit/integration tests across 18 phases for the Hybrid Graph RAG pipeline.</w:t>
       </w:r>
     </w:p>
     <w:p>
@@ -1067,27 +1131,42 @@
     </w:p>
     <w:p>
       <w:r>
-        <w:t>| TC-03 | RAG | Retrieve context for 'SQL' | Top-3 chunks returned (latency &lt;= 100ms) | PASSED |</w:t>
+        <w:t>| TC-03 | Hybrid RAG | Tri-Retrieval Fusion (Vector+BM25+Graph) | Fused RRF candidate ranking (latency &lt;= 650ms) | PASSED |</w:t>
       </w:r>
     </w:p>
     <w:p>
       <w:r>
-        <w:t>| TC-04 | Adaptive | Score &gt;= 80% | Bloom tier advances (+1) | PASSED |</w:t>
+        <w:t>| TC-04 | Graph Store | Neo4j unreachable / uninstalled | Graceful fallback to embedded NetworkX | PASSED |</w:t>
       </w:r>
     </w:p>
     <w:p>
       <w:r>
-        <w:t>| TC-05 | Adaptive | Score &lt; 50% | Bloom tier regresses (-1)| PASSED |</w:t>
+        <w:t>| TC-05 | Adaptive | Score &gt;= 80% | Bloom tier advances (+1) | PASSED |</w:t>
       </w:r>
     </w:p>
     <w:p>
       <w:r>
-        <w:t>| TC-06 | Voice | Synthesize TTS stream | Audio byte stream OK (latency &lt;= 1.2s) | PASSED |</w:t>
+        <w:t>| TC-06 | Adaptive | Score &lt; 50% | Bloom tier regresses (-1) | PASSED |</w:t>
       </w:r>
     </w:p>
     <w:p>
       <w:r>
-        <w:t>| TC-07 | Evaluation | 5-Factor Scoring Formula | Deterministic mathematical score convergence | PASSED |</w:t>
+        <w:t>| TC-07 | Remediation | Session score &lt; 70% | Generates root-cause prerequisite diagnosis | PASSED |</w:t>
+      </w:r>
+    </w:p>
+    <w:p>
+      <w:r>
+        <w:t>| TC-08 | Voice | Synthesize TTS stream | Audio byte stream OK (latency &lt;= 1.2s) | PASSED |</w:t>
+      </w:r>
+    </w:p>
+    <w:p>
+      <w:r>
+        <w:t>| TC-09 | Evaluation | 5-Factor Scoring Formula | Deterministic mathematical score convergence | PASSED |</w:t>
+      </w:r>
+    </w:p>
+    <w:p>
+      <w:r>
+        <w:t>| TC-10 | Benchmark | 274 Suite RAG Phase Tests | 274/274 unit and integration tests passing | PASSED |</w:t>
       </w:r>
     </w:p>
     <w:p>

</xml_diff>